<commit_message>
Add Lab 1 deliverables: requirements table, use-case diagram, flow spec
</commit_message>
<xml_diff>
--- a/requirements-table.docx
+++ b/requirements-table.docx
@@ -46,9 +46,9 @@
         <w:gridCol w:w="900"/>
         <w:gridCol w:w="1200"/>
         <w:gridCol w:w="3600"/>
-        <w:gridCol w:w="900"/>
+        <w:gridCol w:w="1050"/>
         <w:gridCol w:w="3200"/>
-        <w:gridCol w:w="2440"/>
+        <w:gridCol w:w="2290"/>
       </w:tblGrid>
       <w:tr>
         <w:tc>
@@ -107,7 +107,7 @@
         </w:tc>
         <w:tc>
           <w:tcPr>
-            <w:tcW w:type="dxa" w:w="900"/>
+            <w:tcW w:type="dxa" w:w="1050"/>
             <w:shd w:fill="2255AA" w:color="auto" w:val="clear"/>
           </w:tcPr>
           <w:p>
@@ -143,7 +143,7 @@
         </w:tc>
         <w:tc>
           <w:tcPr>
-            <w:tcW w:type="dxa" w:w="2440"/>
+            <w:tcW w:type="dxa" w:w="2290"/>
             <w:shd w:fill="2255AA" w:color="auto" w:val="clear"/>
           </w:tcPr>
           <w:p>
@@ -211,7 +211,7 @@
         </w:tc>
         <w:tc>
           <w:tcPr>
-            <w:tcW w:type="dxa" w:w="900"/>
+            <w:tcW w:type="dxa" w:w="1050"/>
           </w:tcPr>
           <w:p>
             <w:r>
@@ -243,7 +243,7 @@
         </w:tc>
         <w:tc>
           <w:tcPr>
-            <w:tcW w:type="dxa" w:w="2440"/>
+            <w:tcW w:type="dxa" w:w="2290"/>
           </w:tcPr>
           <w:p>
             <w:r>
@@ -309,7 +309,7 @@
         </w:tc>
         <w:tc>
           <w:tcPr>
-            <w:tcW w:type="dxa" w:w="900"/>
+            <w:tcW w:type="dxa" w:w="1050"/>
           </w:tcPr>
           <w:p>
             <w:r>
@@ -341,7 +341,7 @@
         </w:tc>
         <w:tc>
           <w:tcPr>
-            <w:tcW w:type="dxa" w:w="2440"/>
+            <w:tcW w:type="dxa" w:w="2290"/>
           </w:tcPr>
           <w:p>
             <w:r>
@@ -407,7 +407,7 @@
         </w:tc>
         <w:tc>
           <w:tcPr>
-            <w:tcW w:type="dxa" w:w="900"/>
+            <w:tcW w:type="dxa" w:w="1050"/>
           </w:tcPr>
           <w:p>
             <w:r>
@@ -439,7 +439,7 @@
         </w:tc>
         <w:tc>
           <w:tcPr>
-            <w:tcW w:type="dxa" w:w="2440"/>
+            <w:tcW w:type="dxa" w:w="2290"/>
           </w:tcPr>
           <w:p>
             <w:r>
@@ -505,7 +505,7 @@
         </w:tc>
         <w:tc>
           <w:tcPr>
-            <w:tcW w:type="dxa" w:w="900"/>
+            <w:tcW w:type="dxa" w:w="1050"/>
           </w:tcPr>
           <w:p>
             <w:r>
@@ -537,7 +537,7 @@
         </w:tc>
         <w:tc>
           <w:tcPr>
-            <w:tcW w:type="dxa" w:w="2440"/>
+            <w:tcW w:type="dxa" w:w="2290"/>
           </w:tcPr>
           <w:p>
             <w:r>
@@ -603,7 +603,7 @@
         </w:tc>
         <w:tc>
           <w:tcPr>
-            <w:tcW w:type="dxa" w:w="900"/>
+            <w:tcW w:type="dxa" w:w="1050"/>
           </w:tcPr>
           <w:p>
             <w:r>
@@ -635,7 +635,7 @@
         </w:tc>
         <w:tc>
           <w:tcPr>
-            <w:tcW w:type="dxa" w:w="2440"/>
+            <w:tcW w:type="dxa" w:w="2290"/>
           </w:tcPr>
           <w:p>
             <w:r>
@@ -701,7 +701,7 @@
         </w:tc>
         <w:tc>
           <w:tcPr>
-            <w:tcW w:type="dxa" w:w="900"/>
+            <w:tcW w:type="dxa" w:w="1050"/>
           </w:tcPr>
           <w:p>
             <w:r>
@@ -733,7 +733,7 @@
         </w:tc>
         <w:tc>
           <w:tcPr>
-            <w:tcW w:type="dxa" w:w="2440"/>
+            <w:tcW w:type="dxa" w:w="2290"/>
           </w:tcPr>
           <w:p>
             <w:r>
@@ -799,7 +799,7 @@
         </w:tc>
         <w:tc>
           <w:tcPr>
-            <w:tcW w:type="dxa" w:w="900"/>
+            <w:tcW w:type="dxa" w:w="1050"/>
           </w:tcPr>
           <w:p>
             <w:r>
@@ -831,7 +831,7 @@
         </w:tc>
         <w:tc>
           <w:tcPr>
-            <w:tcW w:type="dxa" w:w="2440"/>
+            <w:tcW w:type="dxa" w:w="2290"/>
           </w:tcPr>
           <w:p>
             <w:r>

</xml_diff>